<commit_message>
Update the gap analysis for the work done
Four modules move. Yield prediction and the 14-day weather advice went from
not built to built; the voice assistant from not built to partly built, since
the app speaks now but does not listen; and the dashboard's predicted-yield
figure became possible once harvests were recorded.

6 built, 5 partly built, 5 not built, against 4, 5 and 7 before.

Harvest recording and spray-window advice are added to the closing note of
things the app does that the specification never asked for. Recording
harvests and building the voice assistant come off the list of what to build
next, and a question takes their place: whether voice commands are wanted at
all, given speaking already covers the farmer who cannot read.

Added a section saying what changed, including that several screens were
still showing figures written into the markup, so the real data reaching the
API never reached the farmer.
</commit_message>
<xml_diff>
--- a/docs/documents/SmartKisan_Feature_Gap_Analysis.docx
+++ b/docs/documents/SmartKisan_Feature_Gap_Analysis.docx
@@ -56,7 +56,7 @@
           <w:b/>
           <w:color w:val="1B5E20"/>
         </w:rPr>
-        <w:t>4 are built</w:t>
+        <w:t>6 are built</w:t>
       </w:r>
       <w:r>
         <w:t xml:space="preserve">, </w:t>
@@ -76,7 +76,7 @@
           <w:b/>
           <w:color w:val="C62828"/>
         </w:rPr>
-        <w:t>7 are not built</w:t>
+        <w:t>5 are not built</w:t>
       </w:r>
       <w:r>
         <w:t>.</w:t>
@@ -320,7 +320,6 @@
         <w:tc>
           <w:tcPr>
             <w:tcW w:type="dxa" w:w="864"/>
-            <w:shd w:val="clear" w:fill="FFF8E1"/>
           </w:tcPr>
           <w:p>
             <w:r>
@@ -331,7 +330,6 @@
         <w:tc>
           <w:tcPr>
             <w:tcW w:type="dxa" w:w="4896"/>
-            <w:shd w:val="clear" w:fill="FFF8E1"/>
           </w:tcPr>
           <w:p>
             <w:r>
@@ -342,16 +340,15 @@
         <w:tc>
           <w:tcPr>
             <w:tcW w:type="dxa" w:w="2016"/>
-            <w:shd w:val="clear" w:fill="FFF8E1"/>
           </w:tcPr>
           <w:p>
             <w:r/>
             <w:r>
               <w:rPr>
                 <w:b/>
-                <w:color w:val="E65100"/>
+                <w:color w:val="1B5E20"/>
               </w:rPr>
-              <w:t>Partly built</w:t>
+              <w:t>Built</w:t>
             </w:r>
           </w:p>
         </w:tc>
@@ -440,7 +437,7 @@
         <w:tc>
           <w:tcPr>
             <w:tcW w:type="dxa" w:w="864"/>
-            <w:shd w:val="clear" w:fill="FFEBEE"/>
+            <w:shd w:val="clear" w:fill="FFF8E1"/>
           </w:tcPr>
           <w:p>
             <w:r>
@@ -451,7 +448,7 @@
         <w:tc>
           <w:tcPr>
             <w:tcW w:type="dxa" w:w="4896"/>
-            <w:shd w:val="clear" w:fill="FFEBEE"/>
+            <w:shd w:val="clear" w:fill="FFF8E1"/>
           </w:tcPr>
           <w:p>
             <w:r>
@@ -462,16 +459,16 @@
         <w:tc>
           <w:tcPr>
             <w:tcW w:type="dxa" w:w="2016"/>
-            <w:shd w:val="clear" w:fill="FFEBEE"/>
+            <w:shd w:val="clear" w:fill="FFF8E1"/>
           </w:tcPr>
           <w:p>
             <w:r/>
             <w:r>
               <w:rPr>
                 <w:b/>
-                <w:color w:val="C62828"/>
+                <w:color w:val="E65100"/>
               </w:rPr>
-              <w:t>Not built</w:t>
+              <w:t>Partly built</w:t>
             </w:r>
           </w:p>
         </w:tc>
@@ -677,7 +674,6 @@
         <w:tc>
           <w:tcPr>
             <w:tcW w:type="dxa" w:w="864"/>
-            <w:shd w:val="clear" w:fill="FFEBEE"/>
           </w:tcPr>
           <w:p>
             <w:r>
@@ -688,7 +684,6 @@
         <w:tc>
           <w:tcPr>
             <w:tcW w:type="dxa" w:w="4896"/>
-            <w:shd w:val="clear" w:fill="FFEBEE"/>
           </w:tcPr>
           <w:p>
             <w:r>
@@ -699,16 +694,15 @@
         <w:tc>
           <w:tcPr>
             <w:tcW w:type="dxa" w:w="2016"/>
-            <w:shd w:val="clear" w:fill="FFEBEE"/>
           </w:tcPr>
           <w:p>
             <w:r/>
             <w:r>
               <w:rPr>
                 <w:b/>
-                <w:color w:val="C62828"/>
+                <w:color w:val="1B5E20"/>
               </w:rPr>
-              <w:t>Not built</w:t>
+              <w:t>Built</w:t>
             </w:r>
           </w:p>
         </w:tc>
@@ -843,7 +837,7 @@
         <w:t xml:space="preserve">Missing: </w:t>
       </w:r>
       <w:r>
-        <w:t>The specification's revenue KPI needs market prices, which are not connected yet. Predicted yield needs harvest records, which nothing collects. Widget customisation is not offered.</w:t>
+        <w:t>The specification's revenue KPI needs market prices, which are not connected yet. Widget customisation is not offered. Predicted yield is now available, since harvests are recorded.</w:t>
       </w:r>
     </w:p>
     <w:p>
@@ -978,7 +972,7 @@
       </w:pPr>
       <w:r>
         <w:rPr>
-          <w:color w:val="E65100"/>
+          <w:color w:val="1B5E20"/>
         </w:rPr>
         <w:t>1.5  Weather and Irrigation</w:t>
       </w:r>
@@ -987,9 +981,9 @@
       <w:r>
         <w:rPr>
           <w:b/>
-          <w:color w:val="E65100"/>
+          <w:color w:val="1B5E20"/>
         </w:rPr>
-        <w:t>Partly built</w:t>
+        <w:t>Built</w:t>
       </w:r>
     </w:p>
     <w:p>
@@ -1000,7 +994,7 @@
         <w:t xml:space="preserve">In the app: </w:t>
       </w:r>
       <w:r>
-        <w:t>14-day forecast with temperature, rainfall, humidity and wind, for the farm's own location. An evapotranspiration calculator, an irrigation scheduler that takes soil moisture and forecast into account, historical weather, and wind and humidity detail screens.</w:t>
+        <w:t>A genuine 14-day forecast for the farm's own location - days six to fourteen used to be the first five repeated with random jitter, and now come from a provider that actually forecasts that far. An evapotranspiration calculator, an irrigation scheduler that takes soil moisture and forecast into account, historical weather, and wind and humidity detail. Heat, frost and heavy-rain warnings with the day named; which days are fit to spray and why not on the others, from wind and expected rainfall; and growing degree days.</w:t>
       </w:r>
     </w:p>
     <w:p>
@@ -1011,7 +1005,7 @@
         <w:t xml:space="preserve">Missing: </w:t>
       </w:r>
       <w:r>
-        <w:t>No rain probability heatmap in calendar form. No heat or cold stress alerts against crop-specific thresholds. No wind-based spray scheduling or lodging risk. No growing degree day accumulation.</w:t>
+        <w:t>The rain outlook is worked out but shown as a list rather than the calendar heatmap the specification describes. No lodging-risk warning for tall crops.</w:t>
       </w:r>
     </w:p>
     <w:p>
@@ -1104,7 +1098,7 @@
       </w:pPr>
       <w:r>
         <w:rPr>
-          <w:color w:val="C62828"/>
+          <w:color w:val="E65100"/>
         </w:rPr>
         <w:t>1.8  Voice Assistant</w:t>
       </w:r>
@@ -1113,9 +1107,9 @@
       <w:r>
         <w:rPr>
           <w:b/>
-          <w:color w:val="C62828"/>
+          <w:color w:val="E65100"/>
         </w:rPr>
-        <w:t>Not built</w:t>
+        <w:t>Partly built</w:t>
       </w:r>
     </w:p>
     <w:p>
@@ -1126,7 +1120,7 @@
         <w:t xml:space="preserve">In the app: </w:t>
       </w:r>
       <w:r>
-        <w:t>Nothing. The app is fully translated into the 10 languages the specification lists, so the words exist - but they are read, not spoken.</w:t>
+        <w:t>The app reads its advice aloud in the farmer's own language: the disease diagnosis and its treatment, the weed result including the warning that a grass may be the crop, each farm observation, and the weather warnings. It uses the phone's own voice, so it works without a connection once the language pack is installed, and the button hides itself when the phone has no voice for that language rather than playing silence.</w:t>
       </w:r>
     </w:p>
     <w:p>
@@ -1137,7 +1131,7 @@
         <w:t xml:space="preserve">Missing: </w:t>
       </w:r>
       <w:r>
-        <w:t>No speech-to-text, no text-to-speech, no voice navigation. This is the largest single gap for the intended user: a farmer who reads little cannot use an app that only writes.</w:t>
+        <w:t>Listening is not built - no speech-to-text and no voice navigation. That needs a recogniser, a connection for most Indian languages, and a decision about what happens when it mishears a chemical name. Speaking is the half that helps a farmer who reads little, and it is the half that works offline.</w:t>
       </w:r>
     </w:p>
     <w:p>
@@ -1356,7 +1350,7 @@
       </w:pPr>
       <w:r>
         <w:rPr>
-          <w:color w:val="C62828"/>
+          <w:color w:val="1B5E20"/>
         </w:rPr>
         <w:t>2.4  Yield Predictor</w:t>
       </w:r>
@@ -1365,9 +1359,9 @@
       <w:r>
         <w:rPr>
           <w:b/>
-          <w:color w:val="C62828"/>
+          <w:color w:val="1B5E20"/>
         </w:rPr>
-        <w:t>Not built</w:t>
+        <w:t>Built</w:t>
       </w:r>
     </w:p>
     <w:p>
@@ -1378,7 +1372,7 @@
         <w:t xml:space="preserve">In the app: </w:t>
       </w:r>
       <w:r>
-        <w:t>Nothing.</w:t>
+        <w:t>Expected yield for each crop in the ground, from the farmer's own average yield per acre over the area planted, with the range his past harvests have actually covered. It shows the arithmetic rather than a confidence percentage, and refuses to predict a crop it has never seen harvested.</w:t>
       </w:r>
     </w:p>
     <w:p>
@@ -1389,7 +1383,7 @@
         <w:t xml:space="preserve">Missing: </w:t>
       </w:r>
       <w:r>
-        <w:t>Needs a season of recorded harvests to learn from, and the app does not record a sowing or a harvest at all. Recording those is the sensible next step - it is a small feature and it unlocks both this and harvest performance reporting.</w:t>
+        <w:t>It is the farmer's own history, not a trained model, and is described that way rather than as one. His own land and practice predict his next harvest better than a national average would, but it cannot account for a season unlike any he has recorded.</w:t>
       </w:r>
     </w:p>
     <w:p>
@@ -1555,7 +1549,7 @@
         <w:spacing w:after="200"/>
       </w:pPr>
       <w:r>
-        <w:t>Water, hours, electricity and soil reports run on real data, and a report can be exported as CSV. PDF export and scheduled daily reports are not built.</w:t>
+        <w:t>Water, hours, electricity, soil and harvest reports all run on the farm's own records, and a report can be exported as CSV. PDF export and scheduled daily reports are not built.</w:t>
       </w:r>
     </w:p>
     <w:p>
@@ -1623,41 +1617,7 @@
           <w:b/>
           <w:sz w:val="22"/>
         </w:rPr>
-        <w:t>1. Record sowings and harvests</w:t>
-      </w:r>
-    </w:p>
-    <w:p>
-      <w:pPr>
-        <w:spacing w:after="200"/>
-      </w:pPr>
-      <w:r>
-        <w:t>Small, and it unlocks two other things. Yield prediction cannot be built without a season of harvest records, and the harvest performance report is empty for the same reason. Nothing in the app records either today. Roughly a week.</w:t>
-      </w:r>
-    </w:p>
-    <w:p>
-      <w:r>
-        <w:rPr>
-          <w:b/>
-          <w:sz w:val="22"/>
-        </w:rPr>
-        <w:t>2. Voice assistant</w:t>
-      </w:r>
-    </w:p>
-    <w:p>
-      <w:pPr>
-        <w:spacing w:after="200"/>
-      </w:pPr>
-      <w:r>
-        <w:t>The biggest gap relative to who this app is for. A farmer who reads little cannot use an app that only writes, whatever language it is written in. Speech-to-text and text-to-speech for the 10 languages already translated. Several weeks, and worth costing properly.</w:t>
-      </w:r>
-    </w:p>
-    <w:p>
-      <w:r>
-        <w:rPr>
-          <w:b/>
-          <w:sz w:val="22"/>
-        </w:rPr>
-        <w:t>3. Mandi prices</w:t>
+        <w:t>1. Mandi prices</w:t>
       </w:r>
     </w:p>
     <w:p>
@@ -1674,7 +1634,7 @@
           <w:b/>
           <w:sz w:val="22"/>
         </w:rPr>
-        <w:t>4. Marketplace</w:t>
+        <w:t>2. Marketplace</w:t>
       </w:r>
     </w:p>
     <w:p>
@@ -1691,7 +1651,7 @@
           <w:b/>
           <w:sz w:val="22"/>
         </w:rPr>
-        <w:t>5. Farmer forum</w:t>
+        <w:t>3. Farmer forum</w:t>
       </w:r>
     </w:p>
     <w:p>
@@ -1708,7 +1668,7 @@
           <w:b/>
           <w:sz w:val="22"/>
         </w:rPr>
-        <w:t>6. Blockchain supply chain</w:t>
+        <w:t>4. Blockchain supply chain</w:t>
       </w:r>
     </w:p>
     <w:p>
@@ -1717,6 +1677,23 @@
       </w:pPr>
       <w:r>
         <w:t>Last. It traces produce sold through the marketplace, and there is no marketplace yet, so there is nothing to trace.</w:t>
+      </w:r>
+    </w:p>
+    <w:p>
+      <w:r>
+        <w:rPr>
+          <w:b/>
+          <w:sz w:val="22"/>
+        </w:rPr>
+        <w:t>5. Voice commands, if wanted</w:t>
+      </w:r>
+    </w:p>
+    <w:p>
+      <w:pPr>
+        <w:spacing w:after="200"/>
+      </w:pPr>
+      <w:r>
+        <w:t>The app speaks now; it does not listen. Listening needs a recogniser, a connection for most Indian languages, and a decision about what happens when it mishears a chemical name. Worth deciding whether it is wanted before it is costed - speaking already covers the farmer who cannot read.</w:t>
       </w:r>
     </w:p>
     <w:p>
@@ -1729,7 +1706,35 @@
     </w:p>
     <w:p>
       <w:r>
-        <w:t>That specification describes a Python web platform. The Android app is a separate build and was never a port of it, so a module missing from the app is not necessarily work that was skipped - in several cases the app does the same job a different way, and in a few it does more. The weed detector, the farm task list, one-time code sign-in and account deletion are all in the app and appear nowhere in that document.</w:t>
+        <w:t>That specification describes a Python web platform. The Android app is a separate build and was never a port of it, so a module missing from the app is not necessarily work that was skipped - in several cases the app does the same job a different way, and in a few it does more. The weed detector, the farm task list, harvest recording, spray-window advice, one-time code sign-in and account deletion are all in the app and appear nowhere in that document.</w:t>
+      </w:r>
+    </w:p>
+    <w:p>
+      <w:pPr>
+        <w:pStyle w:val="Heading1"/>
+      </w:pPr>
+      <w:r>
+        <w:t>What changed since the last version of this report</w:t>
+      </w:r>
+    </w:p>
+    <w:p>
+      <w:r>
+        <w:t>Harvest recording was built, which turned yield prediction and the harvest report from impossible into real - both had nothing behind them because nothing recorded what came off a field.</w:t>
+      </w:r>
+    </w:p>
+    <w:p>
+      <w:r>
+        <w:t>The weather forecast beyond five days was invented: the first five days repeated with random variation. It now comes from a provider that forecasts fourteen. The advice those numbers drive - when to spray, what to protect against - was added alongside.</w:t>
+      </w:r>
+    </w:p>
+    <w:p>
+      <w:r>
+        <w:t>The app reads its advice aloud in the farmer's language, which is the half of the voice assistant that helps someone who cannot read and the half that works without a connection.</w:t>
+      </w:r>
+    </w:p>
+    <w:p>
+      <w:r>
+        <w:t>Several screens were still showing figures written into the markup - soil rated Good, a 91.7% harvest efficiency, 2,450 litres, a satellite index of 0.72 - so the real data reaching the API never reached the farmer. Removing them exposed three crashes those invented numbers had been propping up.</w:t>
       </w:r>
     </w:p>
     <w:sectPr>

</xml_diff>